<commit_message>
Add official diploma topic to English report
</commit_message>
<xml_diff>
--- a/docs/predefense/Alau_Term_pre_defense_20_October_2026_EN.docx
+++ b/docs/predefense/Alau_Term_pre_defense_20_October_2026_EN.docx
@@ -8,6 +8,11 @@
       </w:pPr>
       <w:r>
         <w:t>Alau Term diploma project: materials for 20 October 2026</w:t>
+      </w:r>
+    </w:p>
+    <w:p>
+      <w:r>
+        <w:t>Official topic: Development of a digital platform for industrial heating equipment sales and services</w:t>
       </w:r>
     </w:p>
     <w:p>

</xml_diff>